<commit_message>
fix: change mode default 70B
</commit_message>
<xml_diff>
--- a/RAG/Forms/docx/Mau_1.10_-_Giay_nghi_phep_1011143252_2605082746.docx
+++ b/RAG/Forms/docx/Mau_1.10_-_Giay_nghi_phep_1011143252_2605082746.docx
@@ -99,7 +99,7 @@
                 <w:color w:val="000000"/>
                 <w:shd w:val="clear" w:color="auto" w:fill="auto"/>
               </w:rPr>
-              <w:pict w14:anchorId="38D11CC7">
+              <w:pict w14:anchorId="2F95E310">
                 <v:line id="_x0000_s2052" alt="" style="position:absolute;left:0;text-align:left;z-index:1;mso-wrap-edited:f;mso-width-percent:0;mso-height-percent:0;mso-width-percent:0;mso-height-percent:0" from="45.35pt,1.2pt" to="124.1pt,1.2pt">
                   <w10:wrap side="right"/>
                 </v:line>
@@ -237,7 +237,7 @@
                 <w:color w:val="000000"/>
                 <w:shd w:val="clear" w:color="auto" w:fill="auto"/>
               </w:rPr>
-              <w:pict w14:anchorId="1D26ABC2">
+              <w:pict w14:anchorId="4762DF73">
                 <v:line id="_x0000_s2051" alt="" style="position:absolute;left:0;text-align:left;z-index:2;mso-wrap-edited:f;mso-width-percent:0;mso-height-percent:0;mso-width-percent:0;mso-height-percent:0" from="74.85pt,.85pt" to="233.85pt,.85pt">
                   <w10:wrap side="right"/>
                 </v:line>
@@ -435,7 +435,7 @@
           <w:sz w:val="28"/>
           <w:szCs w:val="28"/>
         </w:rPr>
-        <w:pict w14:anchorId="378578BA">
+        <w:pict w14:anchorId="13E5C125">
           <v:line id="_x0000_s2050" alt="" style="position:absolute;left:0;text-align:left;z-index:3;mso-wrap-edited:f;mso-width-percent:0;mso-height-percent:0;mso-width-percent:0;mso-height-percent:0" from="201.45pt,1.45pt" to="266.7pt,1.45pt">
             <w10:wrap side="right"/>
           </v:line>
@@ -492,7 +492,19 @@
           <w:szCs w:val="28"/>
           <w:lang w:val="vi-VN" w:eastAsia="vi-VN"/>
         </w:rPr>
-        <w:t xml:space="preserve"> {{NGAY}} tháng {{THANG</w:t>
+        <w:t xml:space="preserve"> {{NGAY}} tháng {{TH</w:t>
+      </w:r>
+      <w:r>
+        <w:rPr>
+          <w:rStyle w:val="CharChar2"/>
+          <w:rFonts w:ascii="Times New Roman" w:hAnsi="Times New Roman"/>
+          <w:b w:val="0"/>
+          <w:color w:val="000000"/>
+          <w:sz w:val="28"/>
+          <w:szCs w:val="28"/>
+          <w:lang w:val="vi-VN" w:eastAsia="vi-VN"/>
+        </w:rPr>
+        <w:t>ANG}}</w:t>
       </w:r>
       <w:r>
         <w:rPr>

</xml_diff>

<commit_message>
fix: change mode default 70B (#75)
</commit_message>
<xml_diff>
--- a/RAG/Forms/docx/Mau_1.10_-_Giay_nghi_phep_1011143252_2605082746.docx
+++ b/RAG/Forms/docx/Mau_1.10_-_Giay_nghi_phep_1011143252_2605082746.docx
@@ -99,7 +99,7 @@
                 <w:color w:val="000000"/>
                 <w:shd w:val="clear" w:color="auto" w:fill="auto"/>
               </w:rPr>
-              <w:pict w14:anchorId="38D11CC7">
+              <w:pict w14:anchorId="2F95E310">
                 <v:line id="_x0000_s2052" alt="" style="position:absolute;left:0;text-align:left;z-index:1;mso-wrap-edited:f;mso-width-percent:0;mso-height-percent:0;mso-width-percent:0;mso-height-percent:0" from="45.35pt,1.2pt" to="124.1pt,1.2pt">
                   <w10:wrap side="right"/>
                 </v:line>
@@ -237,7 +237,7 @@
                 <w:color w:val="000000"/>
                 <w:shd w:val="clear" w:color="auto" w:fill="auto"/>
               </w:rPr>
-              <w:pict w14:anchorId="1D26ABC2">
+              <w:pict w14:anchorId="4762DF73">
                 <v:line id="_x0000_s2051" alt="" style="position:absolute;left:0;text-align:left;z-index:2;mso-wrap-edited:f;mso-width-percent:0;mso-height-percent:0;mso-width-percent:0;mso-height-percent:0" from="74.85pt,.85pt" to="233.85pt,.85pt">
                   <w10:wrap side="right"/>
                 </v:line>
@@ -435,7 +435,7 @@
           <w:sz w:val="28"/>
           <w:szCs w:val="28"/>
         </w:rPr>
-        <w:pict w14:anchorId="378578BA">
+        <w:pict w14:anchorId="13E5C125">
           <v:line id="_x0000_s2050" alt="" style="position:absolute;left:0;text-align:left;z-index:3;mso-wrap-edited:f;mso-width-percent:0;mso-height-percent:0;mso-width-percent:0;mso-height-percent:0" from="201.45pt,1.45pt" to="266.7pt,1.45pt">
             <w10:wrap side="right"/>
           </v:line>
@@ -492,7 +492,19 @@
           <w:szCs w:val="28"/>
           <w:lang w:val="vi-VN" w:eastAsia="vi-VN"/>
         </w:rPr>
-        <w:t xml:space="preserve"> {{NGAY}} tháng {{THANG</w:t>
+        <w:t xml:space="preserve"> {{NGAY}} tháng {{TH</w:t>
+      </w:r>
+      <w:r>
+        <w:rPr>
+          <w:rStyle w:val="CharChar2"/>
+          <w:rFonts w:ascii="Times New Roman" w:hAnsi="Times New Roman"/>
+          <w:b w:val="0"/>
+          <w:color w:val="000000"/>
+          <w:sz w:val="28"/>
+          <w:szCs w:val="28"/>
+          <w:lang w:val="vi-VN" w:eastAsia="vi-VN"/>
+        </w:rPr>
+        <w:t>ANG}}</w:t>
       </w:r>
       <w:r>
         <w:rPr>

</xml_diff>

<commit_message>
update form template and examples
</commit_message>
<xml_diff>
--- a/RAG/Forms/docx/Mau_1.10_-_Giay_nghi_phep_1011143252_2605082746.docx
+++ b/RAG/Forms/docx/Mau_1.10_-_Giay_nghi_phep_1011143252_2605082746.docx
@@ -99,7 +99,7 @@
                 <w:color w:val="000000"/>
                 <w:shd w:val="clear" w:color="auto" w:fill="auto"/>
               </w:rPr>
-              <w:pict w14:anchorId="2F95E310">
+              <w:pict w14:anchorId="6E82C1C4">
                 <v:line id="_x0000_s2052" alt="" style="position:absolute;left:0;text-align:left;z-index:1;mso-wrap-edited:f;mso-width-percent:0;mso-height-percent:0;mso-width-percent:0;mso-height-percent:0" from="45.35pt,1.2pt" to="124.1pt,1.2pt">
                   <w10:wrap side="right"/>
                 </v:line>
@@ -237,7 +237,7 @@
                 <w:color w:val="000000"/>
                 <w:shd w:val="clear" w:color="auto" w:fill="auto"/>
               </w:rPr>
-              <w:pict w14:anchorId="4762DF73">
+              <w:pict w14:anchorId="39526C2A">
                 <v:line id="_x0000_s2051" alt="" style="position:absolute;left:0;text-align:left;z-index:2;mso-wrap-edited:f;mso-width-percent:0;mso-height-percent:0;mso-width-percent:0;mso-height-percent:0" from="74.85pt,.85pt" to="233.85pt,.85pt">
                   <w10:wrap side="right"/>
                 </v:line>
@@ -435,7 +435,7 @@
           <w:sz w:val="28"/>
           <w:szCs w:val="28"/>
         </w:rPr>
-        <w:pict w14:anchorId="13E5C125">
+        <w:pict w14:anchorId="2CF896FF">
           <v:line id="_x0000_s2050" alt="" style="position:absolute;left:0;text-align:left;z-index:3;mso-wrap-edited:f;mso-width-percent:0;mso-height-percent:0;mso-width-percent:0;mso-height-percent:0" from="201.45pt,1.45pt" to="266.7pt,1.45pt">
             <w10:wrap side="right"/>
           </v:line>
@@ -799,9 +799,9 @@
           <w:color w:val="000000"/>
           <w:sz w:val="28"/>
           <w:szCs w:val="28"/>
-          <w:lang w:eastAsia="vi-VN"/>
+          <w:lang w:val="vi-VN" w:eastAsia="vi-VN"/>
         </w:rPr>
-        <w:tab/>
+        <w:t xml:space="preserve"> </w:t>
       </w:r>
       <w:r>
         <w:rPr>
@@ -823,7 +823,7 @@
           <w:color w:val="000000"/>
           <w:sz w:val="28"/>
           <w:szCs w:val="28"/>
-          <w:lang w:eastAsia="vi-VN"/>
+          <w:lang w:val="vi-VN" w:eastAsia="vi-VN"/>
         </w:rPr>
         <w:t xml:space="preserve"> </w:t>
       </w:r>

</xml_diff>